<commit_message>
Upute bez osobnih podataka i obrazac Kontaktirajte nas
- Upute za suvlasnike i za korištenje aplikacije: umjesto podataka
  administratora prazan okvir za ime, telefon i e-mail.
- Priručnik za administraciju: bez spominjanja Grada Rijeke, primjer
  oznake zgrade ZG-Vodoinstalaterska-1. Ponovno izrađeni PDF-ovi, bez
  imena autora u svojstvima datoteka.
- Javna stranica: zajednički predložak, stranica /kontakt/ čija se
  poruka šalje na KONTAKT_EMAIL (zadano ocitanje-vode@gmail.com), sa
  skrivenim poljem protiv automatskih programa i najviše 5 poruka na sat
  s iste adrese.

Co-Authored-By: Claude Opus 5.5 <noreply@anthropic.com>
Claude-Session: https://claude.ai/code/session_018B2uX2XY2FfXSGyGmZUV7A
</commit_message>
<xml_diff>
--- a/backend/ocitanja/static/javno/upute/ocitanje-vode-upute-za-koristenje-aplikacije.docx
+++ b/backend/ocitanja/static/javno/upute/ocitanje-vode-upute-za-koristenje-aplikacije.docx
@@ -3556,7 +3556,7 @@
                 <w:sz w:val="26"/>
                 <w:szCs w:val="26"/>
               </w:rPr>
-              <w:t xml:space="preserve">ovlašteni predstavnik suvlasnika, Dean Blečić</w:t>
+              <w:t>ovlašteni predstavnik suvlasnika</w:t>
             </w:r>
           </w:p>
           <w:p>
@@ -3570,6 +3570,27 @@
                 <w:sz w:val="26"/>
                 <w:szCs w:val="26"/>
               </w:rPr>
+              <w:t xml:space="preserve">Ime i prezime: </w:t>
+            </w:r>
+            <w:r>
+              <w:rPr>
+                <w:sz w:val="26"/>
+                <w:szCs w:val="26"/>
+              </w:rPr>
+              <w:t xml:space="preserve">______________________________</w:t>
+            </w:r>
+          </w:p>
+          <w:p>
+            <w:pPr>
+              <w:spacing w:after="100" w:line="300"/>
+            </w:pPr>
+            <w:r>
+              <w:rPr>
+                <w:b/>
+                <w:bCs/>
+                <w:sz w:val="26"/>
+                <w:szCs w:val="26"/>
+              </w:rPr>
               <w:t xml:space="preserve">Telefon: </w:t>
             </w:r>
             <w:r>
@@ -3598,7 +3619,7 @@
                 <w:sz w:val="26"/>
                 <w:szCs w:val="26"/>
               </w:rPr>
-              <w:t xml:space="preserve">dean.blecic@gmail.com</w:t>
+              <w:t>______________________________</w:t>
             </w:r>
           </w:p>
         </w:tc>

</xml_diff>